<commit_message>
Experiment19 with key fixes: with adaptive intent gating, collapse‑aware manifold penalty, and data-driven anchors - Implement Option‑B adaptive intent penalty using percentile-based margin threshold - Add research/exploit anchors derived from manifold and blocked exemplars (cold-start safe) - Introduce bounded collapse-severity term for outlier cases to close Exp‑18 safety gap - Normalize embeddings for stable cosine geometry and model-agnostic STL scaling - Retain all Exp‑18 logic/comments; add detailed annotations + TBD section for OptionA+OptionB hybrid Signed-off-by: Chaitanya <pinnamarajuvenkata.chaitanya@cognizant.com>
</commit_message>
<xml_diff>
--- a/Visualization_of_Experimental_Findings.docx
+++ b/Visualization_of_Experimental_Findings.docx
@@ -45,7 +45,7 @@
     <w:p>
       <w:r>
         <w:pict w14:anchorId="411FA323">
-          <v:rect id="_x0000_i1055" style="width:0;height:1.5pt" o:hralign="center" o:hrstd="t" o:hr="t" fillcolor="#a0a0a0" stroked="f"/>
+          <v:rect id="_x0000_i1025" style="width:0;height:1.5pt" o:hralign="center" o:hrstd="t" o:hr="t" fillcolor="#a0a0a0" stroked="f"/>
         </w:pict>
       </w:r>
     </w:p>
@@ -129,15 +129,7 @@
     </w:p>
     <w:p>
       <w:r>
-        <w:t>Figure 1 visualizes the geometric trust boundary enforced by STL by plotting each output’s cosine distance to the trusted semantic manifold against its local density (inverse mean k-nearest-</w:t>
-      </w:r>
-      <w:proofErr w:type="spellStart"/>
-      <w:r>
-        <w:t>neighbor</w:t>
-      </w:r>
-      <w:proofErr w:type="spellEnd"/>
-      <w:r>
-        <w:t xml:space="preserve"> distance). The vertical dashed line represents the compiled semantic contract boundary ε stored in the CSTA.</w:t>
+        <w:t>Figure 1 visualizes the geometric trust boundary enforced by STL by plotting each output’s cosine distance to the trusted semantic manifold against its local density (inverse mean k-nearest-neighbor distance). The vertical dashed line represents the compiled semantic contract boundary ε stored in the CSTA.</w:t>
       </w:r>
     </w:p>
     <w:p>
@@ -198,7 +190,7 @@
     <w:p>
       <w:r>
         <w:pict w14:anchorId="75C2437D">
-          <v:rect id="_x0000_i1056" style="width:0;height:1.5pt" o:hralign="center" o:hrstd="t" o:hr="t" fillcolor="#a0a0a0" stroked="f"/>
+          <v:rect id="_x0000_i1026" style="width:0;height:1.5pt" o:hralign="center" o:hrstd="t" o:hr="t" fillcolor="#a0a0a0" stroked="f"/>
         </w:pict>
       </w:r>
     </w:p>
@@ -336,7 +328,7 @@
     <w:p>
       <w:r>
         <w:pict w14:anchorId="38A40114">
-          <v:rect id="_x0000_i1057" style="width:0;height:1.5pt" o:hralign="center" o:hrstd="t" o:hr="t" fillcolor="#a0a0a0" stroked="f"/>
+          <v:rect id="_x0000_i1027" style="width:0;height:1.5pt" o:hralign="center" o:hrstd="t" o:hr="t" fillcolor="#a0a0a0" stroked="f"/>
         </w:pict>
       </w:r>
     </w:p>
@@ -464,7 +456,7 @@
     <w:p>
       <w:r>
         <w:pict w14:anchorId="06CA410C">
-          <v:rect id="_x0000_i1058" style="width:0;height:1.5pt" o:hralign="center" o:hrstd="t" o:hr="t" fillcolor="#a0a0a0" stroked="f"/>
+          <v:rect id="_x0000_i1028" style="width:0;height:1.5pt" o:hralign="center" o:hrstd="t" o:hr="t" fillcolor="#a0a0a0" stroked="f"/>
         </w:pict>
       </w:r>
     </w:p>
@@ -560,7 +552,7 @@
     <w:p>
       <w:r>
         <w:pict w14:anchorId="182E289A">
-          <v:rect id="_x0000_i1059" style="width:0;height:1.5pt" o:hralign="center" o:hrstd="t" o:hr="t" fillcolor="#a0a0a0" stroked="f"/>
+          <v:rect id="_x0000_i1029" style="width:0;height:1.5pt" o:hralign="center" o:hrstd="t" o:hr="t" fillcolor="#a0a0a0" stroked="f"/>
         </w:pict>
       </w:r>
     </w:p>
@@ -2022,6 +2014,7 @@
   <w:style w:type="character" w:default="1" w:styleId="DefaultParagraphFont">
     <w:name w:val="Default Paragraph Font"/>
     <w:uiPriority w:val="1"/>
+    <w:semiHidden/>
     <w:unhideWhenUsed/>
   </w:style>
   <w:style w:type="table" w:default="1" w:styleId="TableNormal">

</xml_diff>